<commit_message>
User guide v3: add About panel + new-user framing
Adds a 4-row "What this tool does" orientation block at the top of page 1
of the v3 user guide (both editions). Frames Division 296, the reset
election, what the model compares, and the decision the tool supports —
so a brand-new reader gets the "why" before the "how". Also expands TSB
to "Total Super Balance (TSB)" on first use, and adds a one-line gloss
explaining the "reset trap" mechanism on future-loss assets.

No functional / code-model changes — guide content only.

Co-Authored-By: Claude Opus 4.7 <noreply@anthropic.com>
</commit_message>
<xml_diff>
--- a/docs/USER_GUIDE_Adviser_Edition_v3.docx
+++ b/docs/USER_GUIDE_Adviser_Edition_v3.docx
@@ -69,7 +69,7 @@
           <w:color w:val="555555"/>
           <w:sz w:val="20"/>
         </w:rPr>
-        <w:t>Built 2026-06-22</w:t>
+        <w:t>Built 2026-06-23</w:t>
       </w:r>
       <w:r>
         <w:rPr>
@@ -92,6 +92,167 @@
         <w:t>For SMSF advisers who don't use CLASS Super.</w:t>
       </w:r>
     </w:p>
+    <w:p>
+      <w:pPr>
+        <w:spacing w:before="120" w:after="20"/>
+      </w:pPr>
+      <w:r>
+        <w:rPr>
+          <w:rFonts w:ascii="Calibri" w:hAnsi="Calibri"/>
+          <w:b/>
+          <w:i w:val="0"/>
+          <w:color w:val="1D3B34"/>
+          <w:sz w:val="22"/>
+        </w:rPr>
+        <w:t>What this tool does</w:t>
+      </w:r>
+    </w:p>
+    <w:tbl>
+      <w:tblPr>
+        <w:tblW w:type="auto" w:w="0"/>
+        <w:tblLayout w:type="autofit"/>
+        <w:tblLook w:firstColumn="1" w:firstRow="1" w:lastColumn="0" w:lastRow="0" w:noHBand="0" w:noVBand="1" w:val="04A0"/>
+      </w:tblPr>
+      <w:tblGrid>
+        <w:gridCol w:w="10652"/>
+      </w:tblGrid>
+      <w:tr>
+        <w:tc>
+          <w:tcPr>
+            <w:tcW w:type="dxa" w:w="10652"/>
+            <w:shd w:val="clear" w:color="auto" w:fill="F5F1EA"/>
+          </w:tcPr>
+          <w:p>
+            <w:pPr>
+              <w:spacing w:before="20" w:after="20"/>
+            </w:pPr>
+            <w:r/>
+            <w:r>
+              <w:rPr>
+                <w:rFonts w:ascii="Calibri" w:hAnsi="Calibri"/>
+                <w:b/>
+                <w:i w:val="0"/>
+                <w:color w:val="1D3B34"/>
+                <w:sz w:val="19"/>
+              </w:rPr>
+              <w:t>Division 296.</w:t>
+            </w:r>
+            <w:r>
+              <w:rPr>
+                <w:rFonts w:ascii="Calibri" w:hAnsi="Calibri"/>
+                <w:b w:val="0"/>
+                <w:i w:val="0"/>
+                <w:color w:val="333333"/>
+                <w:sz w:val="19"/>
+              </w:rPr>
+              <w:t xml:space="preserve"> From FY 2026–27 (first test 30 Jun 2027), super earnings on the slice of Total Super Balance (TSB) between $3m and $10m attract an extra 15% tax; the slice above $10m attracts an extra 25%. Assessed personally on the member, not on the fund.</w:t>
+            </w:r>
+          </w:p>
+        </w:tc>
+      </w:tr>
+      <w:tr>
+        <w:tc>
+          <w:tcPr>
+            <w:tcW w:type="dxa" w:w="10652"/>
+            <w:shd w:val="clear" w:color="auto" w:fill="F5F1EA"/>
+          </w:tcPr>
+          <w:p>
+            <w:pPr>
+              <w:spacing w:before="20" w:after="20"/>
+            </w:pPr>
+            <w:r/>
+            <w:r>
+              <w:rPr>
+                <w:rFonts w:ascii="Calibri" w:hAnsi="Calibri"/>
+                <w:b/>
+                <w:i w:val="0"/>
+                <w:color w:val="1D3B34"/>
+                <w:sz w:val="19"/>
+              </w:rPr>
+              <w:t>Cost base reset election.</w:t>
+            </w:r>
+            <w:r>
+              <w:rPr>
+                <w:rFonts w:ascii="Calibri" w:hAnsi="Calibri"/>
+                <w:b w:val="0"/>
+                <w:i w:val="0"/>
+                <w:color w:val="333333"/>
+                <w:sz w:val="19"/>
+              </w:rPr>
+              <w:t xml:space="preserve"> A transitional one-off election: step each CGT asset's cost base up to its market value at 30 Jun 2026. Once lodged, irrevocable.</w:t>
+            </w:r>
+          </w:p>
+        </w:tc>
+      </w:tr>
+      <w:tr>
+        <w:tc>
+          <w:tcPr>
+            <w:tcW w:type="dxa" w:w="10652"/>
+            <w:shd w:val="clear" w:color="auto" w:fill="F5F1EA"/>
+          </w:tcPr>
+          <w:p>
+            <w:pPr>
+              <w:spacing w:before="20" w:after="20"/>
+            </w:pPr>
+            <w:r/>
+            <w:r>
+              <w:rPr>
+                <w:rFonts w:ascii="Calibri" w:hAnsi="Calibri"/>
+                <w:b/>
+                <w:i w:val="0"/>
+                <w:color w:val="1D3B34"/>
+                <w:sz w:val="19"/>
+              </w:rPr>
+              <w:t>What this model compares.</w:t>
+            </w:r>
+            <w:r>
+              <w:rPr>
+                <w:rFonts w:ascii="Calibri" w:hAnsi="Calibri"/>
+                <w:b w:val="0"/>
+                <w:i w:val="0"/>
+                <w:color w:val="333333"/>
+                <w:sz w:val="19"/>
+              </w:rPr>
+              <w:t xml:space="preserve"> Reset election ON vs OFF. For each scenario it projects Division 296 tax — and the ordinary CGT that flows from realising the asset.</w:t>
+            </w:r>
+          </w:p>
+        </w:tc>
+      </w:tr>
+      <w:tr>
+        <w:tc>
+          <w:tcPr>
+            <w:tcW w:type="dxa" w:w="10652"/>
+            <w:shd w:val="clear" w:color="auto" w:fill="F5F1EA"/>
+          </w:tcPr>
+          <w:p>
+            <w:pPr>
+              <w:spacing w:before="20" w:after="20"/>
+            </w:pPr>
+            <w:r/>
+            <w:r>
+              <w:rPr>
+                <w:rFonts w:ascii="Calibri" w:hAnsi="Calibri"/>
+                <w:b/>
+                <w:i w:val="0"/>
+                <w:color w:val="1D3B34"/>
+                <w:sz w:val="19"/>
+              </w:rPr>
+              <w:t>Decision it supports.</w:t>
+            </w:r>
+            <w:r>
+              <w:rPr>
+                <w:rFonts w:ascii="Calibri" w:hAnsi="Calibri"/>
+                <w:b w:val="0"/>
+                <w:i w:val="0"/>
+                <w:color w:val="333333"/>
+                <w:sz w:val="19"/>
+              </w:rPr>
+              <w:t xml:space="preserve"> Whether the SMSF should lodge the reset election. Rule of thumb: reset usually saves tax on future-gain assets and costs tax on future-loss assets — net effect depends on the asset mix.</w:t>
+            </w:r>
+          </w:p>
+        </w:tc>
+      </w:tr>
+    </w:tbl>
     <w:tbl>
       <w:tblPr>
         <w:tblW w:type="auto" w:w="0"/>
@@ -423,7 +584,7 @@
                 <w:i w:val="0"/>
                 <w:sz w:val="20"/>
               </w:rPr>
-              <w:t>Type each member's TSB into column B (rows 7–10). Split %, $3m–$10m band, and above-$10m band derive automatically.</w:t>
+              <w:t>Type each member's Total Super Balance (TSB) into column B (rows 7–10). Split %, $3m–$10m band, and above-$10m band derive automatically.</w:t>
             </w:r>
           </w:p>
         </w:tc>
@@ -576,7 +737,7 @@
           <w:i w:val="0"/>
           <w:sz w:val="20"/>
         </w:rPr>
-        <w:t>Comparison tab → Headline cards. Three numbers: total Div 296 tax under each scenario plus the signed net effect. Negative (green) = reset saves tax. Positive (red) = ‘reset trap’ on unrealised-loss assets.</w:t>
+        <w:t>Comparison tab → Headline cards. Three numbers: total Div 296 tax under each scenario plus the signed net effect. Negative (green) = reset saves tax. Positive (red) = ‘reset trap’ — locking in a higher basis on an asset you'll later sell at a loss shrinks that future loss, so net tax goes up.</w:t>
       </w:r>
     </w:p>
     <w:p>

</xml_diff>